<commit_message>
docs(viz): add jax-image-visualization test-coverage results to the SOW
New section 4.8 — 554 tests/35 suites passing, with a coverage table
(lines 71.2%, statements 69.1%, functions 62.1%, branches 52.9%) against the
enforced CI gates (69/67/60/51). Regenerated the SOW docx.
</commit_message>
<xml_diff>
--- a/docs/JIT_UI_visualization_library_SOW.docx
+++ b/docs/JIT_UI_visualization_library_SOW.docx
@@ -1178,6 +1178,267 @@
     </w:p>
     <w:p>
       <w:pPr>
+        <w:pStyle w:val="Heading2"/>
+      </w:pPr>
+      <w:r>
+        <w:t>4.8 Test coverage</w:t>
+      </w:r>
+    </w:p>
+    <w:p>
+      <w:r>
+        <w:rPr>
+          <w:b w:val="0"/>
+          <w:i w:val="0"/>
+        </w:rPr>
+        <w:t>The library carries a Jest unit-test suite — 554 tests across 35 suites, all passing — run in CI with coverage reporting and enforced minimum thresholds, so the build fails if coverage regresses below the gate. Current coverage on the 'openseadragon' branch:</w:t>
+      </w:r>
+    </w:p>
+    <w:tbl>
+      <w:tblPr>
+        <w:tblStyle w:val="LightGrid-Accent1"/>
+        <w:tblW w:type="auto" w:w="0"/>
+        <w:tblLook w:firstColumn="1" w:firstRow="1" w:lastColumn="0" w:lastRow="0" w:noHBand="0" w:noVBand="1" w:val="04A0"/>
+      </w:tblPr>
+      <w:tblGrid>
+        <w:gridCol w:w="2160"/>
+        <w:gridCol w:w="2160"/>
+        <w:gridCol w:w="2160"/>
+        <w:gridCol w:w="2160"/>
+      </w:tblGrid>
+      <w:tr>
+        <w:tc>
+          <w:tcPr>
+            <w:tcW w:type="dxa" w:w="2160"/>
+          </w:tcPr>
+          <w:p>
+            <w:r>
+              <w:rPr>
+                <w:b/>
+              </w:rPr>
+              <w:t>Metric</w:t>
+            </w:r>
+          </w:p>
+        </w:tc>
+        <w:tc>
+          <w:tcPr>
+            <w:tcW w:type="dxa" w:w="2160"/>
+          </w:tcPr>
+          <w:p>
+            <w:r>
+              <w:rPr>
+                <w:b/>
+              </w:rPr>
+              <w:t>Covered</w:t>
+            </w:r>
+          </w:p>
+        </w:tc>
+        <w:tc>
+          <w:tcPr>
+            <w:tcW w:type="dxa" w:w="2160"/>
+          </w:tcPr>
+          <w:p>
+            <w:r>
+              <w:rPr>
+                <w:b/>
+              </w:rPr>
+              <w:t>Covered / total</w:t>
+            </w:r>
+          </w:p>
+        </w:tc>
+        <w:tc>
+          <w:tcPr>
+            <w:tcW w:type="dxa" w:w="2160"/>
+          </w:tcPr>
+          <w:p>
+            <w:r>
+              <w:rPr>
+                <w:b/>
+              </w:rPr>
+              <w:t>CI gate (min)</w:t>
+            </w:r>
+          </w:p>
+        </w:tc>
+      </w:tr>
+      <w:tr>
+        <w:tc>
+          <w:tcPr>
+            <w:tcW w:type="dxa" w:w="2160"/>
+          </w:tcPr>
+          <w:p>
+            <w:r>
+              <w:t>Lines</w:t>
+            </w:r>
+          </w:p>
+        </w:tc>
+        <w:tc>
+          <w:tcPr>
+            <w:tcW w:type="dxa" w:w="2160"/>
+          </w:tcPr>
+          <w:p>
+            <w:r>
+              <w:t>71.2%</w:t>
+            </w:r>
+          </w:p>
+        </w:tc>
+        <w:tc>
+          <w:tcPr>
+            <w:tcW w:type="dxa" w:w="2160"/>
+          </w:tcPr>
+          <w:p>
+            <w:r>
+              <w:t>4095 / 5749</w:t>
+            </w:r>
+          </w:p>
+        </w:tc>
+        <w:tc>
+          <w:tcPr>
+            <w:tcW w:type="dxa" w:w="2160"/>
+          </w:tcPr>
+          <w:p>
+            <w:r>
+              <w:t>69%</w:t>
+            </w:r>
+          </w:p>
+        </w:tc>
+      </w:tr>
+      <w:tr>
+        <w:tc>
+          <w:tcPr>
+            <w:tcW w:type="dxa" w:w="2160"/>
+          </w:tcPr>
+          <w:p>
+            <w:r>
+              <w:t>Statements</w:t>
+            </w:r>
+          </w:p>
+        </w:tc>
+        <w:tc>
+          <w:tcPr>
+            <w:tcW w:type="dxa" w:w="2160"/>
+          </w:tcPr>
+          <w:p>
+            <w:r>
+              <w:t>69.1%</w:t>
+            </w:r>
+          </w:p>
+        </w:tc>
+        <w:tc>
+          <w:tcPr>
+            <w:tcW w:type="dxa" w:w="2160"/>
+          </w:tcPr>
+          <w:p>
+            <w:r>
+              <w:t>4664 / 6751</w:t>
+            </w:r>
+          </w:p>
+        </w:tc>
+        <w:tc>
+          <w:tcPr>
+            <w:tcW w:type="dxa" w:w="2160"/>
+          </w:tcPr>
+          <w:p>
+            <w:r>
+              <w:t>67%</w:t>
+            </w:r>
+          </w:p>
+        </w:tc>
+      </w:tr>
+      <w:tr>
+        <w:tc>
+          <w:tcPr>
+            <w:tcW w:type="dxa" w:w="2160"/>
+          </w:tcPr>
+          <w:p>
+            <w:r>
+              <w:t>Functions</w:t>
+            </w:r>
+          </w:p>
+        </w:tc>
+        <w:tc>
+          <w:tcPr>
+            <w:tcW w:type="dxa" w:w="2160"/>
+          </w:tcPr>
+          <w:p>
+            <w:r>
+              <w:t>62.1%</w:t>
+            </w:r>
+          </w:p>
+        </w:tc>
+        <w:tc>
+          <w:tcPr>
+            <w:tcW w:type="dxa" w:w="2160"/>
+          </w:tcPr>
+          <w:p>
+            <w:r>
+              <w:t>757 / 1219</w:t>
+            </w:r>
+          </w:p>
+        </w:tc>
+        <w:tc>
+          <w:tcPr>
+            <w:tcW w:type="dxa" w:w="2160"/>
+          </w:tcPr>
+          <w:p>
+            <w:r>
+              <w:t>60%</w:t>
+            </w:r>
+          </w:p>
+        </w:tc>
+      </w:tr>
+      <w:tr>
+        <w:tc>
+          <w:tcPr>
+            <w:tcW w:type="dxa" w:w="2160"/>
+          </w:tcPr>
+          <w:p>
+            <w:r>
+              <w:t>Branches</w:t>
+            </w:r>
+          </w:p>
+        </w:tc>
+        <w:tc>
+          <w:tcPr>
+            <w:tcW w:type="dxa" w:w="2160"/>
+          </w:tcPr>
+          <w:p>
+            <w:r>
+              <w:t>52.9%</w:t>
+            </w:r>
+          </w:p>
+        </w:tc>
+        <w:tc>
+          <w:tcPr>
+            <w:tcW w:type="dxa" w:w="2160"/>
+          </w:tcPr>
+          <w:p>
+            <w:r>
+              <w:t>1361 / 2571</w:t>
+            </w:r>
+          </w:p>
+        </w:tc>
+        <w:tc>
+          <w:tcPr>
+            <w:tcW w:type="dxa" w:w="2160"/>
+          </w:tcPr>
+          <w:p>
+            <w:r>
+              <w:t>51%</w:t>
+            </w:r>
+          </w:p>
+        </w:tc>
+      </w:tr>
+    </w:tbl>
+    <w:p>
+      <w:r>
+        <w:rPr>
+          <w:b w:val="0"/>
+          <w:i w:val="0"/>
+        </w:rPr>
+        <w:t>Coverage concentrates on the backend-neutral logic the library owns: the region store and the on-canvas tools (wand, brush, vertex-eraser, zoom-to-box), coordinate transforms, the OpenSeadragon tiled load and slice cache, the display/recolor pipeline, the channel-histogram and region-editor components, and the Plotly viewport/state methods. The lower branch figure reflects defensive backend/DOM guards that are harder to exercise headlessly rather than untested features.</w:t>
+      </w:r>
+    </w:p>
+    <w:p>
+      <w:pPr>
         <w:pStyle w:val="Heading1"/>
       </w:pPr>
       <w:r>

</xml_diff>

<commit_message>
docs(viz): SOW — add example-server + bundled examples task to library extraction
D6 gets an 'Examples + example server' deliverable item and Phase 5 (4.6) a
matching task: a small example server stands in for jit-service (preview /
tiles / histogram / zoom-region) so a bundled set of usage examples runs
standalone from the library repo, shipped with the package as a reference.
</commit_message>
<xml_diff>
--- a/docs/JIT_UI_visualization_library_SOW.docx
+++ b/docs/JIT_UI_visualization_library_SOW.docx
@@ -964,6 +964,17 @@
       </w:r>
     </w:p>
     <w:p>
+      <w:r>
+        <w:rPr>
+          <w:b/>
+        </w:rPr>
+        <w:t xml:space="preserve">Examples + example server: </w:t>
+      </w:r>
+      <w:r>
+        <w:t>Bundle a set of runnable usage examples in the library, powered by a small example server. The example server stands in for jit-service by serving the sample data the viewer needs (preview / tiles-info / tile, histogram, and zoom/region crops), so the examples run standalone from the library repo with no host app and no production backend. The examples demonstrate the main integration paths — embedding &lt;visualization&gt;, the Channels and Histogram dialog, and the region editor, plus implementing the DI ports against the example server — and are shipped with the package (an examples/ app + the lightweight server) as a living reference for downstream adopters.</w:t>
+      </w:r>
+    </w:p>
+    <w:p>
       <w:pPr>
         <w:pStyle w:val="Heading2"/>
       </w:pPr>
@@ -1144,6 +1155,17 @@
       </w:r>
       <w:r>
         <w:t>ng-packagr build is green, Jest tests pass, and a dependency-boundary check confirms the library imports nothing from the host app; the barrel exports the full intended public surface.</w:t>
+      </w:r>
+    </w:p>
+    <w:p>
+      <w:r>
+        <w:rPr>
+          <w:b/>
+        </w:rPr>
+        <w:t xml:space="preserve">Task — examples + example server: </w:t>
+      </w:r>
+      <w:r>
+        <w:t>Add an example server and a bundled set of usage examples (D6). The example server serves sample preview/tile/histogram/zoom-region data so the examples run standalone, exercising the same tile/preview/zoom paths the production viewer uses. Acceptance: the examples run from the library repo against the example server with no host app, and cover embedding &lt;visualization&gt;, the Channels and Histogram dialog, the region editor, and implementing the DI ports.</w:t>
       </w:r>
     </w:p>
     <w:p>

</xml_diff>